<commit_message>
Enforce black text in generated VКР DOCX
Co-authored-by: Колесников Владислав <krons2486@users.noreply.github.com>
</commit_message>
<xml_diff>
--- a/vkr/work_assembly_tool/out/sample_vkr_fragment.docx
+++ b/vkr/work_assembly_tool/out/sample_vkr_fragment.docx
@@ -11,6 +11,7 @@
         <w:rPr>
           <w:b w:val="0"/>
           <w:i w:val="0"/>
+          <w:color w:val="000000"/>
         </w:rPr>
         <w:t>Разработка и внедрение интеллектуального модуля ранжирования кандидатов</w:t>
       </w:r>
@@ -29,6 +30,7 @@
         <w:rPr>
           <w:b w:val="0"/>
           <w:i w:val="0"/>
+          <w:color w:val="000000"/>
         </w:rPr>
         <w:t xml:space="preserve">Текст пояснительной записки оформляется основным стилем. В этом фрагменте есть ссылка на источник [1] и пример выделения </w:t>
       </w:r>
@@ -36,6 +38,7 @@
         <w:rPr>
           <w:b/>
           <w:i w:val="0"/>
+          <w:color w:val="000000"/>
         </w:rPr>
         <w:t>важного термина</w:t>
       </w:r>
@@ -43,6 +46,7 @@
         <w:rPr>
           <w:b w:val="0"/>
           <w:i w:val="0"/>
+          <w:color w:val="000000"/>
         </w:rPr>
         <w:t>.</w:t>
       </w:r>
@@ -61,6 +65,7 @@
         <w:rPr>
           <w:b w:val="0"/>
           <w:i w:val="0"/>
+          <w:color w:val="000000"/>
         </w:rPr>
         <w:t>Основной текст раздела должен быть выровнен по ширине и иметь абзацный отступ.</w:t>
       </w:r>
@@ -73,6 +78,7 @@
         <w:rPr>
           <w:b w:val="0"/>
           <w:i w:val="0"/>
+          <w:color w:val="000000"/>
         </w:rPr>
         <w:t>Таблица 1.1 – Пример таблицы метрик</w:t>
       </w:r>
@@ -183,6 +189,7 @@
         <w:rPr>
           <w:b w:val="0"/>
           <w:i w:val="0"/>
+          <w:color w:val="000000"/>
         </w:rPr>
         <w:t>Рисунок 1.1 – Пример подписи рисунка</w:t>
       </w:r>
@@ -192,12 +199,18 @@
         <w:pStyle w:val="VKRCodeBlock"/>
       </w:pPr>
       <w:r>
+        <w:rPr>
+          <w:color w:val="000000"/>
+        </w:rPr>
         <w:t>def score(candidate, vacancy):</w:t>
       </w:r>
       <w:r>
         <w:br/>
       </w:r>
       <w:r>
+        <w:rPr>
+          <w:color w:val="000000"/>
+        </w:rPr>
         <w:t xml:space="preserve">    return candidate.similarity(vacancy)</w:t>
       </w:r>
     </w:p>
@@ -215,6 +228,7 @@
         <w:rPr>
           <w:b w:val="0"/>
           <w:i w:val="0"/>
+          <w:color w:val="000000"/>
         </w:rPr>
         <w:t>Пункт внутри раздела продолжается на той же странице и не должен начинаться с принудительного разрыва.</w:t>
       </w:r>
@@ -635,6 +649,9 @@
       </w:tabs>
       <w:spacing w:after="0" w:line="240" w:lineRule="auto"/>
     </w:pPr>
+    <w:rPr>
+      <w:color w:val="000000"/>
+    </w:rPr>
   </w:style>
   <w:style w:type="character" w:customStyle="1" w:styleId="HeaderChar">
     <w:name w:val="Header Char"/>
@@ -642,6 +659,9 @@
     <w:link w:val="Header"/>
     <w:uiPriority w:val="99"/>
     <w:rsid w:val="00E618BF"/>
+    <w:rPr>
+      <w:color w:val="000000"/>
+    </w:rPr>
   </w:style>
   <w:style w:type="paragraph" w:styleId="Footer">
     <w:name w:val="footer"/>
@@ -657,6 +677,9 @@
       </w:tabs>
       <w:spacing w:after="0" w:line="240" w:lineRule="auto"/>
     </w:pPr>
+    <w:rPr>
+      <w:color w:val="000000"/>
+    </w:rPr>
   </w:style>
   <w:style w:type="character" w:customStyle="1" w:styleId="FooterChar">
     <w:name w:val="Footer Char"/>
@@ -664,6 +687,9 @@
     <w:link w:val="Footer"/>
     <w:uiPriority w:val="99"/>
     <w:rsid w:val="00E618BF"/>
+    <w:rPr>
+      <w:color w:val="000000"/>
+    </w:rPr>
   </w:style>
   <w:style w:type="paragraph" w:styleId="Heading1">
     <w:name w:val="heading 1"/>
@@ -685,7 +711,7 @@
       <w:rFonts w:asciiTheme="majorHAnsi" w:eastAsiaTheme="majorEastAsia" w:hAnsiTheme="majorHAnsi" w:cstheme="majorBidi" w:ascii="Times New Roman" w:hAnsi="Times New Roman" w:eastAsia="Times New Roman" w:cs="Times New Roman"/>
       <w:b/>
       <w:bCs/>
-      <w:color w:val="365F91" w:themeColor="accent1" w:themeShade="BF"/>
+      <w:color w:val="000000"/>
       <w:sz w:val="28"/>
       <w:szCs w:val="28"/>
     </w:rPr>
@@ -710,7 +736,7 @@
       <w:rFonts w:asciiTheme="majorHAnsi" w:eastAsiaTheme="majorEastAsia" w:hAnsiTheme="majorHAnsi" w:cstheme="majorBidi" w:ascii="Times New Roman" w:hAnsi="Times New Roman" w:eastAsia="Times New Roman" w:cs="Times New Roman"/>
       <w:b/>
       <w:bCs/>
-      <w:color w:val="4F81BD" w:themeColor="accent1"/>
+      <w:color w:val="000000"/>
       <w:sz w:val="26"/>
       <w:szCs w:val="26"/>
     </w:rPr>
@@ -735,7 +761,7 @@
       <w:rFonts w:asciiTheme="majorHAnsi" w:eastAsiaTheme="majorEastAsia" w:hAnsiTheme="majorHAnsi" w:cstheme="majorBidi" w:ascii="Times New Roman" w:hAnsi="Times New Roman" w:eastAsia="Times New Roman" w:cs="Times New Roman"/>
       <w:b/>
       <w:bCs/>
-      <w:color w:val="4F81BD" w:themeColor="accent1"/>
+      <w:color w:val="000000"/>
       <w:sz w:val="24"/>
     </w:rPr>
   </w:style>
@@ -761,7 +787,7 @@
       <w:bCs/>
       <w:i/>
       <w:iCs/>
-      <w:color w:val="4F81BD" w:themeColor="accent1"/>
+      <w:color w:val="000000"/>
     </w:rPr>
   </w:style>
   <w:style w:type="paragraph" w:styleId="Heading5">
@@ -782,7 +808,7 @@
     </w:pPr>
     <w:rPr>
       <w:rFonts w:asciiTheme="majorHAnsi" w:eastAsiaTheme="majorEastAsia" w:hAnsiTheme="majorHAnsi" w:cstheme="majorBidi"/>
-      <w:color w:val="243F60" w:themeColor="accent1" w:themeShade="7F"/>
+      <w:color w:val="000000"/>
     </w:rPr>
   </w:style>
   <w:style w:type="paragraph" w:styleId="Heading6">
@@ -805,7 +831,7 @@
       <w:rFonts w:asciiTheme="majorHAnsi" w:eastAsiaTheme="majorEastAsia" w:hAnsiTheme="majorHAnsi" w:cstheme="majorBidi"/>
       <w:i/>
       <w:iCs/>
-      <w:color w:val="243F60" w:themeColor="accent1" w:themeShade="7F"/>
+      <w:color w:val="000000"/>
     </w:rPr>
   </w:style>
   <w:style w:type="paragraph" w:styleId="Heading7">
@@ -828,7 +854,7 @@
       <w:rFonts w:asciiTheme="majorHAnsi" w:eastAsiaTheme="majorEastAsia" w:hAnsiTheme="majorHAnsi" w:cstheme="majorBidi"/>
       <w:i/>
       <w:iCs/>
-      <w:color w:val="404040" w:themeColor="text1" w:themeTint="BF"/>
+      <w:color w:val="000000"/>
     </w:rPr>
   </w:style>
   <w:style w:type="paragraph" w:styleId="Heading8">
@@ -849,7 +875,7 @@
     </w:pPr>
     <w:rPr>
       <w:rFonts w:asciiTheme="majorHAnsi" w:eastAsiaTheme="majorEastAsia" w:hAnsiTheme="majorHAnsi" w:cstheme="majorBidi"/>
-      <w:color w:val="4F81BD" w:themeColor="accent1"/>
+      <w:color w:val="000000"/>
       <w:sz w:val="20"/>
       <w:szCs w:val="20"/>
     </w:rPr>
@@ -874,7 +900,7 @@
       <w:rFonts w:asciiTheme="majorHAnsi" w:eastAsiaTheme="majorEastAsia" w:hAnsiTheme="majorHAnsi" w:cstheme="majorBidi"/>
       <w:i/>
       <w:iCs/>
-      <w:color w:val="404040" w:themeColor="text1" w:themeTint="BF"/>
+      <w:color w:val="000000"/>
       <w:sz w:val="20"/>
       <w:szCs w:val="20"/>
     </w:rPr>
@@ -884,6 +910,9 @@
     <w:uiPriority w:val="1"/>
     <w:semiHidden/>
     <w:unhideWhenUsed/>
+    <w:rPr>
+      <w:color w:val="000000"/>
+    </w:rPr>
   </w:style>
   <w:style w:type="table" w:default="1" w:styleId="TableNormal">
     <w:name w:val="Normal Table"/>
@@ -914,6 +943,9 @@
     <w:pPr>
       <w:spacing w:after="0" w:line="240" w:lineRule="auto"/>
     </w:pPr>
+    <w:rPr>
+      <w:color w:val="000000"/>
+    </w:rPr>
   </w:style>
   <w:style w:type="character" w:customStyle="1" w:styleId="Heading1Char">
     <w:name w:val="Heading 1 Char"/>
@@ -925,7 +957,7 @@
       <w:rFonts w:asciiTheme="majorHAnsi" w:eastAsiaTheme="majorEastAsia" w:hAnsiTheme="majorHAnsi" w:cstheme="majorBidi"/>
       <w:b/>
       <w:bCs/>
-      <w:color w:val="365F91" w:themeColor="accent1" w:themeShade="BF"/>
+      <w:color w:val="000000"/>
       <w:sz w:val="28"/>
       <w:szCs w:val="28"/>
     </w:rPr>
@@ -940,7 +972,7 @@
       <w:rFonts w:asciiTheme="majorHAnsi" w:eastAsiaTheme="majorEastAsia" w:hAnsiTheme="majorHAnsi" w:cstheme="majorBidi"/>
       <w:b/>
       <w:bCs/>
-      <w:color w:val="4F81BD" w:themeColor="accent1"/>
+      <w:color w:val="000000"/>
       <w:sz w:val="26"/>
       <w:szCs w:val="26"/>
     </w:rPr>
@@ -955,7 +987,7 @@
       <w:rFonts w:asciiTheme="majorHAnsi" w:eastAsiaTheme="majorEastAsia" w:hAnsiTheme="majorHAnsi" w:cstheme="majorBidi"/>
       <w:b/>
       <w:bCs/>
-      <w:color w:val="4F81BD" w:themeColor="accent1"/>
+      <w:color w:val="000000"/>
     </w:rPr>
   </w:style>
   <w:style w:type="paragraph" w:styleId="Title">
@@ -975,7 +1007,7 @@
     </w:pPr>
     <w:rPr>
       <w:rFonts w:asciiTheme="majorHAnsi" w:eastAsiaTheme="majorEastAsia" w:hAnsiTheme="majorHAnsi" w:cstheme="majorBidi"/>
-      <w:color w:val="17365D" w:themeColor="text2" w:themeShade="BF"/>
+      <w:color w:val="000000"/>
       <w:spacing w:val="5"/>
       <w:kern w:val="28"/>
       <w:sz w:val="52"/>
@@ -990,7 +1022,7 @@
     <w:rsid w:val="00FC693F"/>
     <w:rPr>
       <w:rFonts w:asciiTheme="majorHAnsi" w:eastAsiaTheme="majorEastAsia" w:hAnsiTheme="majorHAnsi" w:cstheme="majorBidi"/>
-      <w:color w:val="17365D" w:themeColor="text2" w:themeShade="BF"/>
+      <w:color w:val="000000"/>
       <w:spacing w:val="5"/>
       <w:kern w:val="28"/>
       <w:sz w:val="52"/>
@@ -1014,7 +1046,7 @@
       <w:rFonts w:asciiTheme="majorHAnsi" w:eastAsiaTheme="majorEastAsia" w:hAnsiTheme="majorHAnsi" w:cstheme="majorBidi"/>
       <w:i/>
       <w:iCs/>
-      <w:color w:val="4F81BD" w:themeColor="accent1"/>
+      <w:color w:val="000000"/>
       <w:spacing w:val="15"/>
       <w:sz w:val="24"/>
       <w:szCs w:val="24"/>
@@ -1030,7 +1062,7 @@
       <w:rFonts w:asciiTheme="majorHAnsi" w:eastAsiaTheme="majorEastAsia" w:hAnsiTheme="majorHAnsi" w:cstheme="majorBidi"/>
       <w:i/>
       <w:iCs/>
-      <w:color w:val="4F81BD" w:themeColor="accent1"/>
+      <w:color w:val="000000"/>
       <w:spacing w:val="15"/>
       <w:sz w:val="24"/>
       <w:szCs w:val="24"/>
@@ -1046,6 +1078,9 @@
       <w:ind w:left="720"/>
       <w:contextualSpacing/>
     </w:pPr>
+    <w:rPr>
+      <w:color w:val="000000"/>
+    </w:rPr>
   </w:style>
   <w:style w:type="paragraph" w:styleId="BodyText">
     <w:name w:val="Body Text"/>
@@ -1057,6 +1092,9 @@
     <w:pPr>
       <w:spacing w:after="120"/>
     </w:pPr>
+    <w:rPr>
+      <w:color w:val="000000"/>
+    </w:rPr>
   </w:style>
   <w:style w:type="character" w:customStyle="1" w:styleId="BodyTextChar">
     <w:name w:val="Body Text Char"/>
@@ -1064,6 +1102,9 @@
     <w:link w:val="BodyText"/>
     <w:uiPriority w:val="99"/>
     <w:rsid w:val="00AA1D8D"/>
+    <w:rPr>
+      <w:color w:val="000000"/>
+    </w:rPr>
   </w:style>
   <w:style w:type="paragraph" w:styleId="BodyText2">
     <w:name w:val="Body Text 2"/>
@@ -1075,6 +1116,9 @@
     <w:pPr>
       <w:spacing w:after="120" w:line="480" w:lineRule="auto"/>
     </w:pPr>
+    <w:rPr>
+      <w:color w:val="000000"/>
+    </w:rPr>
   </w:style>
   <w:style w:type="character" w:customStyle="1" w:styleId="BodyText2Char">
     <w:name w:val="Body Text 2 Char"/>
@@ -1082,6 +1126,9 @@
     <w:link w:val="BodyText2"/>
     <w:uiPriority w:val="99"/>
     <w:rsid w:val="00AA1D8D"/>
+    <w:rPr>
+      <w:color w:val="000000"/>
+    </w:rPr>
   </w:style>
   <w:style w:type="paragraph" w:styleId="BodyText3">
     <w:name w:val="Body Text 3"/>
@@ -1094,6 +1141,7 @@
       <w:spacing w:after="120"/>
     </w:pPr>
     <w:rPr>
+      <w:color w:val="000000"/>
       <w:sz w:val="16"/>
       <w:szCs w:val="16"/>
     </w:rPr>
@@ -1105,6 +1153,7 @@
     <w:uiPriority w:val="99"/>
     <w:rsid w:val="00AA1D8D"/>
     <w:rPr>
+      <w:color w:val="000000"/>
       <w:sz w:val="16"/>
       <w:szCs w:val="16"/>
     </w:rPr>
@@ -1119,6 +1168,9 @@
       <w:ind w:left="360" w:hanging="360"/>
       <w:contextualSpacing/>
     </w:pPr>
+    <w:rPr>
+      <w:color w:val="000000"/>
+    </w:rPr>
   </w:style>
   <w:style w:type="paragraph" w:styleId="List2">
     <w:name w:val="List 2"/>
@@ -1130,6 +1182,9 @@
       <w:ind w:left="720" w:hanging="360"/>
       <w:contextualSpacing/>
     </w:pPr>
+    <w:rPr>
+      <w:color w:val="000000"/>
+    </w:rPr>
   </w:style>
   <w:style w:type="paragraph" w:styleId="List3">
     <w:name w:val="List 3"/>
@@ -1141,6 +1196,9 @@
       <w:ind w:left="1080" w:hanging="360"/>
       <w:contextualSpacing/>
     </w:pPr>
+    <w:rPr>
+      <w:color w:val="000000"/>
+    </w:rPr>
   </w:style>
   <w:style w:type="paragraph" w:styleId="ListBullet">
     <w:name w:val="List Bullet"/>
@@ -1157,6 +1215,7 @@
     </w:pPr>
     <w:rPr>
       <w:rFonts w:ascii="Times New Roman" w:hAnsi="Times New Roman" w:eastAsia="Times New Roman" w:cs="Times New Roman"/>
+      <w:color w:val="000000"/>
       <w:sz w:val="24"/>
     </w:rPr>
   </w:style>
@@ -1172,6 +1231,9 @@
       </w:numPr>
       <w:contextualSpacing/>
     </w:pPr>
+    <w:rPr>
+      <w:color w:val="000000"/>
+    </w:rPr>
   </w:style>
   <w:style w:type="paragraph" w:styleId="ListBullet3">
     <w:name w:val="List Bullet 3"/>
@@ -1185,6 +1247,9 @@
       </w:numPr>
       <w:contextualSpacing/>
     </w:pPr>
+    <w:rPr>
+      <w:color w:val="000000"/>
+    </w:rPr>
   </w:style>
   <w:style w:type="paragraph" w:styleId="ListNumber">
     <w:name w:val="List Number"/>
@@ -1201,6 +1266,7 @@
     </w:pPr>
     <w:rPr>
       <w:rFonts w:ascii="Times New Roman" w:hAnsi="Times New Roman" w:eastAsia="Times New Roman" w:cs="Times New Roman"/>
+      <w:color w:val="000000"/>
       <w:sz w:val="24"/>
     </w:rPr>
   </w:style>
@@ -1216,6 +1282,9 @@
       </w:numPr>
       <w:contextualSpacing/>
     </w:pPr>
+    <w:rPr>
+      <w:color w:val="000000"/>
+    </w:rPr>
   </w:style>
   <w:style w:type="paragraph" w:styleId="ListNumber3">
     <w:name w:val="List Number 3"/>
@@ -1229,6 +1298,9 @@
       </w:numPr>
       <w:contextualSpacing/>
     </w:pPr>
+    <w:rPr>
+      <w:color w:val="000000"/>
+    </w:rPr>
   </w:style>
   <w:style w:type="paragraph" w:styleId="ListContinue">
     <w:name w:val="List Continue"/>
@@ -1241,6 +1313,9 @@
       <w:ind w:left="360"/>
       <w:contextualSpacing/>
     </w:pPr>
+    <w:rPr>
+      <w:color w:val="000000"/>
+    </w:rPr>
   </w:style>
   <w:style w:type="paragraph" w:styleId="ListContinue2">
     <w:name w:val="List Continue 2"/>
@@ -1253,6 +1328,9 @@
       <w:ind w:left="720"/>
       <w:contextualSpacing/>
     </w:pPr>
+    <w:rPr>
+      <w:color w:val="000000"/>
+    </w:rPr>
   </w:style>
   <w:style w:type="paragraph" w:styleId="ListContinue3">
     <w:name w:val="List Continue 3"/>
@@ -1265,6 +1343,9 @@
       <w:ind w:left="1080"/>
       <w:contextualSpacing/>
     </w:pPr>
+    <w:rPr>
+      <w:color w:val="000000"/>
+    </w:rPr>
   </w:style>
   <w:style w:type="paragraph" w:styleId="MacroText">
     <w:name w:val="macro"/>
@@ -1285,6 +1366,7 @@
     </w:pPr>
     <w:rPr>
       <w:rFonts w:ascii="Courier" w:hAnsi="Courier"/>
+      <w:color w:val="000000"/>
       <w:sz w:val="20"/>
       <w:szCs w:val="20"/>
     </w:rPr>
@@ -1297,6 +1379,7 @@
     <w:rsid w:val="0029639D"/>
     <w:rPr>
       <w:rFonts w:ascii="Courier" w:hAnsi="Courier"/>
+      <w:color w:val="000000"/>
       <w:sz w:val="20"/>
       <w:szCs w:val="20"/>
     </w:rPr>
@@ -1312,7 +1395,7 @@
     <w:rPr>
       <w:i/>
       <w:iCs/>
-      <w:color w:val="000000" w:themeColor="text1"/>
+      <w:color w:val="000000"/>
     </w:rPr>
   </w:style>
   <w:style w:type="character" w:customStyle="1" w:styleId="QuoteChar">
@@ -1324,7 +1407,7 @@
     <w:rPr>
       <w:i/>
       <w:iCs/>
-      <w:color w:val="000000" w:themeColor="text1"/>
+      <w:color w:val="000000"/>
     </w:rPr>
   </w:style>
   <w:style w:type="character" w:customStyle="1" w:styleId="Heading4Char">
@@ -1340,7 +1423,7 @@
       <w:bCs/>
       <w:i/>
       <w:iCs/>
-      <w:color w:val="4F81BD" w:themeColor="accent1"/>
+      <w:color w:val="000000"/>
     </w:rPr>
   </w:style>
   <w:style w:type="character" w:customStyle="1" w:styleId="Heading5Char">
@@ -1352,7 +1435,7 @@
     <w:rsid w:val="00FC693F"/>
     <w:rPr>
       <w:rFonts w:asciiTheme="majorHAnsi" w:eastAsiaTheme="majorEastAsia" w:hAnsiTheme="majorHAnsi" w:cstheme="majorBidi"/>
-      <w:color w:val="243F60" w:themeColor="accent1" w:themeShade="7F"/>
+      <w:color w:val="000000"/>
     </w:rPr>
   </w:style>
   <w:style w:type="character" w:customStyle="1" w:styleId="Heading6Char">
@@ -1366,7 +1449,7 @@
       <w:rFonts w:asciiTheme="majorHAnsi" w:eastAsiaTheme="majorEastAsia" w:hAnsiTheme="majorHAnsi" w:cstheme="majorBidi"/>
       <w:i/>
       <w:iCs/>
-      <w:color w:val="243F60" w:themeColor="accent1" w:themeShade="7F"/>
+      <w:color w:val="000000"/>
     </w:rPr>
   </w:style>
   <w:style w:type="character" w:customStyle="1" w:styleId="Heading7Char">
@@ -1380,7 +1463,7 @@
       <w:rFonts w:asciiTheme="majorHAnsi" w:eastAsiaTheme="majorEastAsia" w:hAnsiTheme="majorHAnsi" w:cstheme="majorBidi"/>
       <w:i/>
       <w:iCs/>
-      <w:color w:val="404040" w:themeColor="text1" w:themeTint="BF"/>
+      <w:color w:val="000000"/>
     </w:rPr>
   </w:style>
   <w:style w:type="character" w:customStyle="1" w:styleId="Heading8Char">
@@ -1392,7 +1475,7 @@
     <w:rsid w:val="00FC693F"/>
     <w:rPr>
       <w:rFonts w:asciiTheme="majorHAnsi" w:eastAsiaTheme="majorEastAsia" w:hAnsiTheme="majorHAnsi" w:cstheme="majorBidi"/>
-      <w:color w:val="4F81BD" w:themeColor="accent1"/>
+      <w:color w:val="000000"/>
       <w:sz w:val="20"/>
       <w:szCs w:val="20"/>
     </w:rPr>
@@ -1408,7 +1491,7 @@
       <w:rFonts w:asciiTheme="majorHAnsi" w:eastAsiaTheme="majorEastAsia" w:hAnsiTheme="majorHAnsi" w:cstheme="majorBidi"/>
       <w:i/>
       <w:iCs/>
-      <w:color w:val="404040" w:themeColor="text1" w:themeTint="BF"/>
+      <w:color w:val="000000"/>
       <w:sz w:val="20"/>
       <w:szCs w:val="20"/>
     </w:rPr>
@@ -1428,7 +1511,7 @@
     <w:rPr>
       <w:b/>
       <w:bCs/>
-      <w:color w:val="4F81BD" w:themeColor="accent1"/>
+      <w:color w:val="000000"/>
       <w:sz w:val="18"/>
       <w:szCs w:val="18"/>
     </w:rPr>
@@ -1442,6 +1525,7 @@
     <w:rPr>
       <w:b/>
       <w:bCs/>
+      <w:color w:val="000000"/>
     </w:rPr>
   </w:style>
   <w:style w:type="character" w:styleId="Emphasis">
@@ -1453,6 +1537,7 @@
     <w:rPr>
       <w:i/>
       <w:iCs/>
+      <w:color w:val="000000"/>
     </w:rPr>
   </w:style>
   <w:style w:type="paragraph" w:styleId="IntenseQuote">
@@ -1475,7 +1560,7 @@
       <w:bCs/>
       <w:i/>
       <w:iCs/>
-      <w:color w:val="4F81BD" w:themeColor="accent1"/>
+      <w:color w:val="000000"/>
     </w:rPr>
   </w:style>
   <w:style w:type="character" w:customStyle="1" w:styleId="IntenseQuoteChar">
@@ -1489,7 +1574,7 @@
       <w:bCs/>
       <w:i/>
       <w:iCs/>
-      <w:color w:val="4F81BD" w:themeColor="accent1"/>
+      <w:color w:val="000000"/>
     </w:rPr>
   </w:style>
   <w:style w:type="character" w:styleId="SubtleEmphasis">
@@ -1501,7 +1586,7 @@
     <w:rPr>
       <w:i/>
       <w:iCs/>
-      <w:color w:val="808080" w:themeColor="text1" w:themeTint="7F"/>
+      <w:color w:val="000000"/>
     </w:rPr>
   </w:style>
   <w:style w:type="character" w:styleId="IntenseEmphasis">
@@ -1515,7 +1600,7 @@
       <w:bCs/>
       <w:i/>
       <w:iCs/>
-      <w:color w:val="4F81BD" w:themeColor="accent1"/>
+      <w:color w:val="000000"/>
     </w:rPr>
   </w:style>
   <w:style w:type="character" w:styleId="SubtleReference">
@@ -1526,7 +1611,7 @@
     <w:rsid w:val="00FC693F"/>
     <w:rPr>
       <w:smallCaps/>
-      <w:color w:val="C0504D" w:themeColor="accent2"/>
+      <w:color w:val="000000"/>
       <w:u w:val="single"/>
     </w:rPr>
   </w:style>
@@ -1540,7 +1625,7 @@
       <w:b/>
       <w:bCs/>
       <w:smallCaps/>
-      <w:color w:val="C0504D" w:themeColor="accent2"/>
+      <w:color w:val="000000"/>
       <w:spacing w:val="5"/>
       <w:u w:val="single"/>
     </w:rPr>
@@ -1555,6 +1640,7 @@
       <w:b/>
       <w:bCs/>
       <w:smallCaps/>
+      <w:color w:val="000000"/>
       <w:spacing w:val="5"/>
     </w:rPr>
   </w:style>
@@ -1570,6 +1656,9 @@
     <w:pPr>
       <w:outlineLvl w:val="9"/>
     </w:pPr>
+    <w:rPr>
+      <w:color w:val="000000"/>
+    </w:rPr>
   </w:style>
   <w:style w:type="table" w:styleId="TableGrid">
     <w:name w:val="Table Grid"/>

</xml_diff>